<commit_message>
Remove first-line indent from body paragraphs
Co-Authored-By: Claude Opus 5.5 <noreply@anthropic.com>
Claude-Session: https://claude.ai/code/session_01GCchbYXryKBoz5ScznJmLu
</commit_message>
<xml_diff>
--- a/BC-BTL-CXHCNCDX-Nhom-13.docx
+++ b/BC-BTL-CXHCNCDX-Nhom-13.docx
@@ -1077,7 +1077,7 @@
     <w:p>
       <w:pPr>
         <w:spacing w:after="120"/>
-        <w:ind w:left="360" w:firstLine="720"/>
+        <w:ind w:left="360"/>
         <w:jc w:val="both"/>
         <w:rPr>
           <w:rFonts w:ascii="Times New Roman" w:eastAsia="Times New Roman" w:hAnsi="Times New Roman" w:cs="Times New Roman"/>
@@ -1113,7 +1113,7 @@
     <w:p>
       <w:pPr>
         <w:spacing w:after="120"/>
-        <w:ind w:left="360" w:firstLine="720"/>
+        <w:ind w:left="360"/>
         <w:jc w:val="both"/>
         <w:rPr>
           <w:rFonts w:ascii="Times New Roman" w:eastAsia="Times New Roman" w:hAnsi="Times New Roman" w:cs="Times New Roman"/>
@@ -1141,7 +1141,7 @@
     <w:p>
       <w:pPr>
         <w:spacing w:after="120"/>
-        <w:ind w:left="360" w:firstLine="720"/>
+        <w:ind w:left="360"/>
         <w:jc w:val="both"/>
         <w:rPr>
           <w:rFonts w:ascii="Times New Roman" w:eastAsia="Times New Roman" w:hAnsi="Times New Roman" w:cs="Times New Roman"/>
@@ -1185,7 +1185,7 @@
     <w:p>
       <w:pPr>
         <w:spacing w:after="120"/>
-        <w:ind w:left="360" w:firstLine="720"/>
+        <w:ind w:left="360"/>
         <w:jc w:val="both"/>
         <w:rPr>
           <w:rFonts w:ascii="Times New Roman" w:eastAsia="Times New Roman" w:hAnsi="Times New Roman" w:cs="Times New Roman"/>
@@ -1213,7 +1213,7 @@
     <w:p>
       <w:pPr>
         <w:spacing w:after="120"/>
-        <w:ind w:left="360" w:firstLine="720"/>
+        <w:ind w:left="360"/>
         <w:jc w:val="both"/>
         <w:rPr>
           <w:rFonts w:ascii="Times New Roman" w:eastAsia="Times New Roman" w:hAnsi="Times New Roman" w:cs="Times New Roman"/>
@@ -1257,7 +1257,7 @@
     <w:p>
       <w:pPr>
         <w:spacing w:after="120"/>
-        <w:ind w:left="360" w:firstLine="720"/>
+        <w:ind w:left="360"/>
         <w:jc w:val="both"/>
         <w:rPr>
           <w:rFonts w:ascii="Times New Roman" w:eastAsia="Times New Roman" w:hAnsi="Times New Roman" w:cs="Times New Roman"/>
@@ -4699,7 +4699,7 @@
                 <w:b/>
                 <w:webHidden/>
               </w:rPr>
-              <w:t>33</w:t>
+              <w:t>32</w:t>
             </w:r>
             <w:r>
               <w:rPr>
@@ -5909,7 +5909,7 @@
     <w:p>
       <w:pPr>
         <w:spacing w:after="120"/>
-        <w:ind w:left="360" w:firstLine="720"/>
+        <w:ind w:left="360"/>
         <w:jc w:val="both"/>
         <w:rPr>
           <w:rFonts w:ascii="Times New Roman" w:eastAsia="Times New Roman" w:hAnsi="Times New Roman" w:cs="Times New Roman"/>
@@ -6572,7 +6572,7 @@
     <w:p>
       <w:pPr>
         <w:spacing w:after="120"/>
-        <w:ind w:left="360" w:firstLine="720"/>
+        <w:ind w:left="360"/>
         <w:jc w:val="both"/>
         <w:rPr>
           <w:rFonts w:ascii="Times New Roman" w:eastAsia="Times New Roman" w:hAnsi="Times New Roman" w:cs="Times New Roman"/>
@@ -6592,7 +6592,7 @@
     <w:p>
       <w:pPr>
         <w:spacing w:after="120"/>
-        <w:ind w:left="360" w:firstLine="720"/>
+        <w:ind w:left="360"/>
         <w:jc w:val="both"/>
         <w:rPr>
           <w:rFonts w:ascii="Times New Roman" w:eastAsia="Times New Roman" w:hAnsi="Times New Roman" w:cs="Times New Roman"/>
@@ -6612,7 +6612,7 @@
     <w:p>
       <w:pPr>
         <w:spacing w:after="120"/>
-        <w:ind w:left="360" w:firstLine="720"/>
+        <w:ind w:left="360"/>
         <w:jc w:val="both"/>
         <w:rPr>
           <w:rFonts w:ascii="Times New Roman" w:eastAsia="Times New Roman" w:hAnsi="Times New Roman" w:cs="Times New Roman"/>
@@ -7914,7 +7914,7 @@
     <w:p>
       <w:pPr>
         <w:spacing w:after="120"/>
-        <w:ind w:left="360" w:firstLine="720"/>
+        <w:ind w:left="360"/>
         <w:jc w:val="both"/>
         <w:rPr>
           <w:rFonts w:ascii="Times New Roman" w:eastAsia="Times New Roman" w:hAnsi="Times New Roman" w:cs="Times New Roman"/>
@@ -7962,7 +7962,7 @@
     <w:p>
       <w:pPr>
         <w:spacing w:after="120"/>
-        <w:ind w:left="360" w:firstLine="720"/>
+        <w:ind w:left="360"/>
         <w:jc w:val="both"/>
         <w:rPr>
           <w:rFonts w:ascii="Times New Roman" w:eastAsia="Times New Roman" w:hAnsi="Times New Roman" w:cs="Times New Roman"/>
@@ -8039,7 +8039,7 @@
     <w:p>
       <w:pPr>
         <w:spacing w:after="120"/>
-        <w:ind w:left="360" w:firstLine="720"/>
+        <w:ind w:left="360"/>
         <w:jc w:val="both"/>
         <w:rPr>
           <w:rFonts w:ascii="Times New Roman" w:eastAsia="Times New Roman" w:hAnsi="Times New Roman" w:cs="Times New Roman"/>
@@ -8087,7 +8087,7 @@
     <w:p>
       <w:pPr>
         <w:spacing w:after="120"/>
-        <w:ind w:left="360" w:firstLine="720"/>
+        <w:ind w:left="360"/>
         <w:jc w:val="both"/>
         <w:rPr>
           <w:rFonts w:ascii="Times New Roman" w:eastAsia="Times New Roman" w:hAnsi="Times New Roman" w:cs="Times New Roman"/>
@@ -9796,7 +9796,7 @@
     <w:p>
       <w:pPr>
         <w:spacing w:after="120"/>
-        <w:ind w:left="360" w:firstLine="720"/>
+        <w:ind w:left="360"/>
         <w:jc w:val="both"/>
         <w:rPr>
           <w:rFonts w:ascii="Times New Roman" w:eastAsia="Times New Roman" w:hAnsi="Times New Roman" w:cs="Times New Roman"/>
@@ -10566,7 +10566,7 @@
     <w:p>
       <w:pPr>
         <w:spacing w:after="120"/>
-        <w:ind w:left="360" w:firstLine="720"/>
+        <w:ind w:left="360"/>
         <w:jc w:val="both"/>
         <w:rPr>
           <w:rFonts w:ascii="Times New Roman" w:eastAsia="Times New Roman" w:hAnsi="Times New Roman" w:cs="Times New Roman"/>
@@ -10614,7 +10614,7 @@
     <w:p>
       <w:pPr>
         <w:spacing w:after="120"/>
-        <w:ind w:left="360" w:firstLine="720"/>
+        <w:ind w:left="360"/>
         <w:jc w:val="both"/>
         <w:rPr>
           <w:rFonts w:ascii="Times New Roman" w:eastAsia="Times New Roman" w:hAnsi="Times New Roman" w:cs="Times New Roman"/>
@@ -10634,7 +10634,7 @@
     <w:p>
       <w:pPr>
         <w:spacing w:after="120"/>
-        <w:ind w:left="360" w:firstLine="720"/>
+        <w:ind w:left="360"/>
         <w:jc w:val="both"/>
         <w:rPr>
           <w:rFonts w:ascii="Times New Roman" w:eastAsia="Times New Roman" w:hAnsi="Times New Roman" w:cs="Times New Roman"/>
@@ -10654,7 +10654,7 @@
     <w:p>
       <w:pPr>
         <w:spacing w:after="120"/>
-        <w:ind w:left="360" w:firstLine="720"/>
+        <w:ind w:left="360"/>
         <w:jc w:val="both"/>
         <w:rPr>
           <w:rFonts w:ascii="Times New Roman" w:eastAsia="Times New Roman" w:hAnsi="Times New Roman" w:cs="Times New Roman"/>
@@ -10682,7 +10682,7 @@
     <w:p>
       <w:pPr>
         <w:spacing w:after="120"/>
-        <w:ind w:left="360" w:firstLine="720"/>
+        <w:ind w:left="360"/>
         <w:jc w:val="both"/>
         <w:rPr>
           <w:rFonts w:ascii="Times New Roman" w:eastAsia="Times New Roman" w:hAnsi="Times New Roman" w:cs="Times New Roman"/>
@@ -10702,7 +10702,7 @@
     <w:p>
       <w:pPr>
         <w:spacing w:after="120"/>
-        <w:ind w:left="360" w:firstLine="720"/>
+        <w:ind w:left="360"/>
         <w:jc w:val="both"/>
         <w:rPr>
           <w:rFonts w:ascii="Times New Roman" w:eastAsia="Times New Roman" w:hAnsi="Times New Roman" w:cs="Times New Roman"/>
@@ -10730,7 +10730,7 @@
     <w:p>
       <w:pPr>
         <w:spacing w:after="120"/>
-        <w:ind w:left="360" w:firstLine="720"/>
+        <w:ind w:left="360"/>
         <w:jc w:val="both"/>
         <w:rPr>
           <w:rFonts w:ascii="Times New Roman" w:eastAsia="Times New Roman" w:hAnsi="Times New Roman" w:cs="Times New Roman"/>
@@ -10750,7 +10750,7 @@
     <w:p>
       <w:pPr>
         <w:spacing w:after="120"/>
-        <w:ind w:left="360" w:firstLine="720"/>
+        <w:ind w:left="360"/>
         <w:jc w:val="both"/>
         <w:rPr>
           <w:rFonts w:ascii="Times New Roman" w:eastAsia="Times New Roman" w:hAnsi="Times New Roman" w:cs="Times New Roman"/>
@@ -10798,7 +10798,7 @@
     <w:p>
       <w:pPr>
         <w:spacing w:after="120"/>
-        <w:ind w:left="360" w:firstLine="720"/>
+        <w:ind w:left="360"/>
         <w:jc w:val="both"/>
         <w:rPr>
           <w:rFonts w:ascii="Times New Roman" w:eastAsia="Times New Roman" w:hAnsi="Times New Roman" w:cs="Times New Roman"/>
@@ -11548,7 +11548,7 @@
     <w:p>
       <w:pPr>
         <w:spacing w:after="120"/>
-        <w:ind w:left="360" w:firstLine="720"/>
+        <w:ind w:left="360"/>
         <w:jc w:val="both"/>
         <w:rPr>
           <w:rFonts w:ascii="Times New Roman" w:eastAsia="Times New Roman" w:hAnsi="Times New Roman" w:cs="Times New Roman"/>
@@ -11576,7 +11576,7 @@
     <w:p>
       <w:pPr>
         <w:spacing w:after="120"/>
-        <w:ind w:left="360" w:firstLine="720"/>
+        <w:ind w:left="360"/>
         <w:jc w:val="both"/>
         <w:rPr>
           <w:rFonts w:ascii="Times New Roman" w:eastAsia="Times New Roman" w:hAnsi="Times New Roman" w:cs="Times New Roman"/>
@@ -11624,7 +11624,7 @@
     <w:p>
       <w:pPr>
         <w:spacing w:after="120"/>
-        <w:ind w:left="360" w:firstLine="720"/>
+        <w:ind w:left="360"/>
         <w:jc w:val="both"/>
         <w:rPr>
           <w:rFonts w:ascii="Times New Roman" w:eastAsia="Times New Roman" w:hAnsi="Times New Roman" w:cs="Times New Roman"/>
@@ -11652,7 +11652,7 @@
     <w:p>
       <w:pPr>
         <w:spacing w:after="120"/>
-        <w:ind w:left="360" w:firstLine="720"/>
+        <w:ind w:left="360"/>
         <w:jc w:val="both"/>
         <w:rPr>
           <w:rFonts w:ascii="Times New Roman" w:eastAsia="Times New Roman" w:hAnsi="Times New Roman" w:cs="Times New Roman"/>
@@ -11672,7 +11672,7 @@
     <w:p>
       <w:pPr>
         <w:spacing w:after="120"/>
-        <w:ind w:left="360" w:firstLine="720"/>
+        <w:ind w:left="360"/>
         <w:jc w:val="both"/>
         <w:rPr>
           <w:rFonts w:ascii="Times New Roman" w:eastAsia="Times New Roman" w:hAnsi="Times New Roman" w:cs="Times New Roman"/>
@@ -11692,7 +11692,7 @@
     <w:p>
       <w:pPr>
         <w:spacing w:after="120"/>
-        <w:ind w:left="360" w:firstLine="720"/>
+        <w:ind w:left="360"/>
         <w:jc w:val="both"/>
         <w:rPr>
           <w:rFonts w:ascii="Times New Roman" w:eastAsia="Times New Roman" w:hAnsi="Times New Roman" w:cs="Times New Roman"/>
@@ -11740,7 +11740,7 @@
     <w:p>
       <w:pPr>
         <w:spacing w:after="120"/>
-        <w:ind w:left="360" w:firstLine="720"/>
+        <w:ind w:left="360"/>
         <w:jc w:val="both"/>
         <w:rPr>
           <w:rFonts w:ascii="Times New Roman" w:eastAsia="Times New Roman" w:hAnsi="Times New Roman" w:cs="Times New Roman"/>
@@ -11760,7 +11760,7 @@
     <w:p>
       <w:pPr>
         <w:spacing w:after="120"/>
-        <w:ind w:left="360" w:firstLine="720"/>
+        <w:ind w:left="360"/>
         <w:jc w:val="both"/>
         <w:rPr>
           <w:rFonts w:ascii="Times New Roman" w:eastAsia="Times New Roman" w:hAnsi="Times New Roman" w:cs="Times New Roman"/>
@@ -11780,7 +11780,7 @@
     <w:p>
       <w:pPr>
         <w:spacing w:after="120"/>
-        <w:ind w:left="360" w:firstLine="720"/>
+        <w:ind w:left="360"/>
         <w:jc w:val="both"/>
         <w:rPr>
           <w:rFonts w:ascii="Times New Roman" w:eastAsia="Times New Roman" w:hAnsi="Times New Roman" w:cs="Times New Roman"/>
@@ -12148,7 +12148,7 @@
     <w:p>
       <w:pPr>
         <w:spacing w:after="160"/>
-        <w:ind w:left="360" w:firstLine="720"/>
+        <w:ind w:left="360"/>
         <w:jc w:val="both"/>
       </w:pPr>
       <w:r>
@@ -12165,7 +12165,7 @@
     <w:p>
       <w:pPr>
         <w:spacing w:after="120"/>
-        <w:ind w:left="360" w:firstLine="720"/>
+        <w:ind w:left="360"/>
         <w:jc w:val="both"/>
         <w:rPr>
           <w:rFonts w:ascii="Times New Roman" w:eastAsia="Times New Roman" w:hAnsi="Times New Roman" w:cs="Times New Roman"/>
@@ -12213,7 +12213,7 @@
     <w:p>
       <w:pPr>
         <w:spacing w:after="120"/>
-        <w:ind w:left="360" w:firstLine="720"/>
+        <w:ind w:left="360"/>
         <w:jc w:val="both"/>
         <w:rPr>
           <w:rFonts w:ascii="Times New Roman" w:eastAsia="Times New Roman" w:hAnsi="Times New Roman" w:cs="Times New Roman"/>
@@ -13605,7 +13605,7 @@
     <w:p>
       <w:pPr>
         <w:spacing w:after="120"/>
-        <w:ind w:left="360" w:firstLine="720"/>
+        <w:ind w:left="360"/>
         <w:jc w:val="both"/>
         <w:rPr>
           <w:rFonts w:ascii="Times New Roman" w:eastAsia="Times New Roman" w:hAnsi="Times New Roman" w:cs="Times New Roman"/>
@@ -13661,7 +13661,7 @@
     <w:p>
       <w:pPr>
         <w:spacing w:after="120"/>
-        <w:ind w:left="360" w:firstLine="720"/>
+        <w:ind w:left="360"/>
         <w:jc w:val="both"/>
         <w:rPr>
           <w:rFonts w:ascii="Times New Roman" w:eastAsia="Times New Roman" w:hAnsi="Times New Roman" w:cs="Times New Roman"/>
@@ -13681,7 +13681,7 @@
     <w:p>
       <w:pPr>
         <w:spacing w:after="120"/>
-        <w:ind w:left="360" w:firstLine="720"/>
+        <w:ind w:left="360"/>
         <w:jc w:val="both"/>
         <w:rPr>
           <w:rFonts w:ascii="Times New Roman" w:eastAsia="Times New Roman" w:hAnsi="Times New Roman" w:cs="Times New Roman"/>
@@ -13701,7 +13701,7 @@
     <w:p>
       <w:pPr>
         <w:spacing w:after="120"/>
-        <w:ind w:left="360" w:firstLine="720"/>
+        <w:ind w:left="360"/>
         <w:jc w:val="both"/>
         <w:rPr>
           <w:rFonts w:ascii="Times New Roman" w:eastAsia="Times New Roman" w:hAnsi="Times New Roman" w:cs="Times New Roman"/>
@@ -13721,7 +13721,7 @@
     <w:p>
       <w:pPr>
         <w:spacing w:after="120"/>
-        <w:ind w:left="360" w:firstLine="720"/>
+        <w:ind w:left="360"/>
         <w:jc w:val="both"/>
         <w:rPr>
           <w:rFonts w:ascii="Times New Roman" w:eastAsia="Times New Roman" w:hAnsi="Times New Roman" w:cs="Times New Roman"/>
@@ -13769,7 +13769,7 @@
     <w:p>
       <w:pPr>
         <w:spacing w:after="120"/>
-        <w:ind w:left="360" w:firstLine="720"/>
+        <w:ind w:left="360"/>
         <w:jc w:val="both"/>
         <w:rPr>
           <w:rFonts w:ascii="Times New Roman" w:eastAsia="Times New Roman" w:hAnsi="Times New Roman" w:cs="Times New Roman"/>
@@ -13789,7 +13789,7 @@
     <w:p>
       <w:pPr>
         <w:spacing w:after="120"/>
-        <w:ind w:left="360" w:firstLine="720"/>
+        <w:ind w:left="360"/>
         <w:jc w:val="both"/>
         <w:rPr>
           <w:rFonts w:ascii="Times New Roman" w:eastAsia="Times New Roman" w:hAnsi="Times New Roman" w:cs="Times New Roman"/>
@@ -13838,7 +13838,7 @@
     <w:p>
       <w:pPr>
         <w:spacing w:after="120"/>
-        <w:ind w:left="360" w:firstLine="720"/>
+        <w:ind w:left="360"/>
         <w:jc w:val="both"/>
         <w:rPr>
           <w:rFonts w:ascii="Times New Roman" w:eastAsia="Times New Roman" w:hAnsi="Times New Roman" w:cs="Times New Roman"/>
@@ -13886,7 +13886,7 @@
     <w:p>
       <w:pPr>
         <w:spacing w:after="120"/>
-        <w:ind w:left="360" w:firstLine="720"/>
+        <w:ind w:left="360"/>
         <w:jc w:val="both"/>
         <w:rPr>
           <w:rFonts w:ascii="Times New Roman" w:eastAsia="Times New Roman" w:hAnsi="Times New Roman" w:cs="Times New Roman"/>
@@ -13914,7 +13914,7 @@
     <w:p>
       <w:pPr>
         <w:spacing w:after="120"/>
-        <w:ind w:left="360" w:firstLine="720"/>
+        <w:ind w:left="360"/>
         <w:jc w:val="both"/>
         <w:rPr>
           <w:rFonts w:ascii="Times New Roman" w:eastAsia="Times New Roman" w:hAnsi="Times New Roman" w:cs="Times New Roman"/>
@@ -13958,7 +13958,7 @@
     <w:p>
       <w:pPr>
         <w:spacing w:after="120"/>
-        <w:ind w:left="360" w:firstLine="720"/>
+        <w:ind w:left="360"/>
         <w:jc w:val="both"/>
         <w:rPr>
           <w:rFonts w:ascii="Times New Roman" w:eastAsia="Times New Roman" w:hAnsi="Times New Roman" w:cs="Times New Roman"/>
@@ -14580,7 +14580,7 @@
     <w:p>
       <w:pPr>
         <w:spacing w:after="120"/>
-        <w:ind w:left="360" w:firstLine="720"/>
+        <w:ind w:left="360"/>
         <w:jc w:val="both"/>
         <w:rPr>
           <w:rFonts w:ascii="Times New Roman" w:eastAsia="Times New Roman" w:hAnsi="Times New Roman" w:cs="Times New Roman"/>
@@ -14608,7 +14608,7 @@
     <w:p>
       <w:pPr>
         <w:spacing w:after="120"/>
-        <w:ind w:left="360" w:firstLine="720"/>
+        <w:ind w:left="360"/>
         <w:jc w:val="both"/>
         <w:rPr>
           <w:rFonts w:ascii="Times New Roman" w:eastAsia="Times New Roman" w:hAnsi="Times New Roman" w:cs="Times New Roman"/>
@@ -14636,7 +14636,7 @@
     <w:p>
       <w:pPr>
         <w:spacing w:after="120"/>
-        <w:ind w:left="360" w:firstLine="720"/>
+        <w:ind w:left="360"/>
         <w:jc w:val="both"/>
         <w:rPr>
           <w:rFonts w:ascii="Times New Roman" w:eastAsia="Times New Roman" w:hAnsi="Times New Roman" w:cs="Times New Roman"/>
@@ -14664,7 +14664,7 @@
     <w:p>
       <w:pPr>
         <w:spacing w:after="120"/>
-        <w:ind w:left="360" w:firstLine="720"/>
+        <w:ind w:left="360"/>
         <w:jc w:val="both"/>
         <w:rPr>
           <w:rFonts w:ascii="Times New Roman" w:eastAsia="Times New Roman" w:hAnsi="Times New Roman" w:cs="Times New Roman"/>
@@ -14700,7 +14700,7 @@
     <w:p>
       <w:pPr>
         <w:spacing w:after="120"/>
-        <w:ind w:left="360" w:firstLine="720"/>
+        <w:ind w:left="360"/>
         <w:jc w:val="both"/>
         <w:rPr>
           <w:rFonts w:ascii="Times New Roman" w:eastAsia="Times New Roman" w:hAnsi="Times New Roman" w:cs="Times New Roman"/>
@@ -14720,7 +14720,7 @@
     <w:p>
       <w:pPr>
         <w:spacing w:after="120"/>
-        <w:ind w:left="360" w:firstLine="720"/>
+        <w:ind w:left="360"/>
         <w:jc w:val="both"/>
         <w:rPr>
           <w:rFonts w:ascii="Times New Roman" w:eastAsia="Times New Roman" w:hAnsi="Times New Roman" w:cs="Times New Roman"/>
@@ -14768,7 +14768,7 @@
     <w:p>
       <w:pPr>
         <w:spacing w:after="120"/>
-        <w:ind w:left="360" w:firstLine="720"/>
+        <w:ind w:left="360"/>
         <w:jc w:val="both"/>
         <w:rPr>
           <w:rFonts w:ascii="Times New Roman" w:eastAsia="Times New Roman" w:hAnsi="Times New Roman" w:cs="Times New Roman"/>
@@ -15292,7 +15292,7 @@
     <w:p>
       <w:pPr>
         <w:spacing w:after="120"/>
-        <w:ind w:left="360" w:firstLine="720"/>
+        <w:ind w:left="360"/>
         <w:jc w:val="both"/>
         <w:rPr>
           <w:rFonts w:ascii="Times New Roman" w:eastAsia="Times New Roman" w:hAnsi="Times New Roman" w:cs="Times New Roman"/>
@@ -15336,7 +15336,7 @@
     <w:p>
       <w:pPr>
         <w:spacing w:after="120"/>
-        <w:ind w:left="360" w:firstLine="720"/>
+        <w:ind w:left="360"/>
         <w:jc w:val="both"/>
         <w:rPr>
           <w:rFonts w:ascii="Times New Roman" w:eastAsia="Times New Roman" w:hAnsi="Times New Roman" w:cs="Times New Roman"/>
@@ -15384,7 +15384,7 @@
     <w:p>
       <w:pPr>
         <w:spacing w:after="120"/>
-        <w:ind w:left="360" w:firstLine="720"/>
+        <w:ind w:left="360"/>
         <w:jc w:val="both"/>
         <w:rPr>
           <w:rFonts w:ascii="Times New Roman" w:eastAsia="Times New Roman" w:hAnsi="Times New Roman" w:cs="Times New Roman"/>
@@ -15420,7 +15420,7 @@
     <w:p>
       <w:pPr>
         <w:spacing w:after="120"/>
-        <w:ind w:left="360" w:firstLine="720"/>
+        <w:ind w:left="360"/>
         <w:jc w:val="both"/>
         <w:rPr>
           <w:rFonts w:ascii="Times New Roman" w:eastAsia="Times New Roman" w:hAnsi="Times New Roman" w:cs="Times New Roman"/>
@@ -15456,7 +15456,7 @@
     <w:p>
       <w:pPr>
         <w:spacing w:after="120"/>
-        <w:ind w:left="360" w:firstLine="720"/>
+        <w:ind w:left="360"/>
         <w:jc w:val="both"/>
         <w:rPr>
           <w:rFonts w:ascii="Times New Roman" w:eastAsia="Times New Roman" w:hAnsi="Times New Roman" w:cs="Times New Roman"/>
@@ -15512,7 +15512,7 @@
     <w:p>
       <w:pPr>
         <w:spacing w:after="120"/>
-        <w:ind w:left="360" w:firstLine="720"/>
+        <w:ind w:left="360"/>
         <w:jc w:val="both"/>
         <w:rPr>
           <w:rFonts w:ascii="Times New Roman" w:eastAsia="Times New Roman" w:hAnsi="Times New Roman" w:cs="Times New Roman"/>
@@ -16197,7 +16197,7 @@
     <w:p>
       <w:pPr>
         <w:spacing w:after="120"/>
-        <w:ind w:left="360" w:firstLine="720"/>
+        <w:ind w:left="360"/>
         <w:jc w:val="both"/>
         <w:rPr>
           <w:rFonts w:ascii="Times New Roman" w:eastAsia="Times New Roman" w:hAnsi="Times New Roman" w:cs="Times New Roman"/>
@@ -16253,7 +16253,7 @@
     <w:p>
       <w:pPr>
         <w:spacing w:after="120"/>
-        <w:ind w:left="360" w:firstLine="720"/>
+        <w:ind w:left="360"/>
         <w:jc w:val="both"/>
         <w:rPr>
           <w:rFonts w:ascii="Times New Roman" w:eastAsia="Times New Roman" w:hAnsi="Times New Roman" w:cs="Times New Roman"/>
@@ -16273,7 +16273,7 @@
     <w:p>
       <w:pPr>
         <w:spacing w:after="120"/>
-        <w:ind w:left="360" w:firstLine="720"/>
+        <w:ind w:left="360"/>
         <w:jc w:val="both"/>
         <w:rPr>
           <w:rFonts w:ascii="Times New Roman" w:eastAsia="Times New Roman" w:hAnsi="Times New Roman" w:cs="Times New Roman"/>
@@ -16309,7 +16309,7 @@
     <w:p>
       <w:pPr>
         <w:spacing w:after="120"/>
-        <w:ind w:left="360" w:firstLine="720"/>
+        <w:ind w:left="360"/>
         <w:jc w:val="both"/>
         <w:rPr>
           <w:rFonts w:ascii="Times New Roman" w:eastAsia="Times New Roman" w:hAnsi="Times New Roman" w:cs="Times New Roman"/>
@@ -16357,7 +16357,7 @@
     <w:p>
       <w:pPr>
         <w:spacing w:after="120"/>
-        <w:ind w:left="360" w:firstLine="720"/>
+        <w:ind w:left="360"/>
         <w:jc w:val="both"/>
         <w:rPr>
           <w:rFonts w:ascii="Times New Roman" w:eastAsia="Times New Roman" w:hAnsi="Times New Roman" w:cs="Times New Roman"/>
@@ -16385,7 +16385,7 @@
     <w:p>
       <w:pPr>
         <w:spacing w:after="120"/>
-        <w:ind w:left="360" w:firstLine="720"/>
+        <w:ind w:left="360"/>
         <w:jc w:val="both"/>
         <w:rPr>
           <w:rFonts w:ascii="Times New Roman" w:eastAsia="Times New Roman" w:hAnsi="Times New Roman" w:cs="Times New Roman"/>
@@ -16421,7 +16421,7 @@
     <w:p>
       <w:pPr>
         <w:spacing w:after="120"/>
-        <w:ind w:left="360" w:firstLine="720"/>
+        <w:ind w:left="360"/>
         <w:jc w:val="both"/>
         <w:rPr>
           <w:rFonts w:ascii="Times New Roman" w:eastAsia="Times New Roman" w:hAnsi="Times New Roman" w:cs="Times New Roman"/>
@@ -16469,7 +16469,7 @@
     <w:p>
       <w:pPr>
         <w:spacing w:after="120"/>
-        <w:ind w:left="360" w:firstLine="720"/>
+        <w:ind w:left="360"/>
         <w:jc w:val="both"/>
         <w:rPr>
           <w:rFonts w:ascii="Times New Roman" w:eastAsia="Times New Roman" w:hAnsi="Times New Roman" w:cs="Times New Roman"/>
@@ -16497,7 +16497,7 @@
     <w:p>
       <w:pPr>
         <w:spacing w:after="120"/>
-        <w:ind w:left="360" w:firstLine="720"/>
+        <w:ind w:left="360"/>
         <w:jc w:val="both"/>
         <w:rPr>
           <w:rFonts w:ascii="Times New Roman" w:eastAsia="Times New Roman" w:hAnsi="Times New Roman" w:cs="Times New Roman"/>
@@ -17563,7 +17563,7 @@
     <w:p>
       <w:pPr>
         <w:spacing w:after="160"/>
-        <w:ind w:left="360" w:firstLine="720"/>
+        <w:ind w:left="360"/>
         <w:jc w:val="both"/>
       </w:pPr>
       <w:r>
@@ -17580,7 +17580,7 @@
     <w:p>
       <w:pPr>
         <w:spacing w:after="120"/>
-        <w:ind w:left="360" w:firstLine="720"/>
+        <w:ind w:left="360"/>
         <w:jc w:val="both"/>
         <w:rPr>
           <w:rFonts w:ascii="Times New Roman" w:eastAsia="Times New Roman" w:hAnsi="Times New Roman" w:cs="Times New Roman"/>
@@ -17644,7 +17644,7 @@
     <w:p>
       <w:pPr>
         <w:spacing w:after="120"/>
-        <w:ind w:left="360" w:firstLine="720"/>
+        <w:ind w:left="360"/>
         <w:jc w:val="both"/>
         <w:rPr>
           <w:rFonts w:ascii="Times New Roman" w:eastAsia="Times New Roman" w:hAnsi="Times New Roman" w:cs="Times New Roman"/>
@@ -17680,7 +17680,7 @@
     <w:p>
       <w:pPr>
         <w:spacing w:after="120"/>
-        <w:ind w:left="360" w:firstLine="720"/>
+        <w:ind w:left="360"/>
         <w:jc w:val="both"/>
         <w:rPr>
           <w:rFonts w:ascii="Times New Roman" w:eastAsia="Times New Roman" w:hAnsi="Times New Roman" w:cs="Times New Roman"/>
@@ -17752,7 +17752,7 @@
     <w:p>
       <w:pPr>
         <w:spacing w:after="120"/>
-        <w:ind w:left="360" w:firstLine="720"/>
+        <w:ind w:left="360"/>
         <w:jc w:val="both"/>
         <w:rPr>
           <w:rFonts w:ascii="Times New Roman" w:eastAsia="Times New Roman" w:hAnsi="Times New Roman" w:cs="Times New Roman"/>
@@ -17772,7 +17772,7 @@
     <w:p>
       <w:pPr>
         <w:spacing w:after="120"/>
-        <w:ind w:left="360" w:firstLine="720"/>
+        <w:ind w:left="360"/>
         <w:jc w:val="both"/>
         <w:rPr>
           <w:rFonts w:ascii="Times New Roman" w:eastAsia="Times New Roman" w:hAnsi="Times New Roman" w:cs="Times New Roman"/>
@@ -17808,7 +17808,7 @@
     <w:p>
       <w:pPr>
         <w:spacing w:after="120"/>
-        <w:ind w:left="360" w:firstLine="720"/>
+        <w:ind w:left="360"/>
         <w:jc w:val="both"/>
         <w:rPr>
           <w:rFonts w:ascii="Times New Roman" w:eastAsia="Times New Roman" w:hAnsi="Times New Roman" w:cs="Times New Roman"/>
@@ -17836,7 +17836,7 @@
     <w:p>
       <w:pPr>
         <w:spacing w:after="120"/>
-        <w:ind w:left="360" w:firstLine="720"/>
+        <w:ind w:left="360"/>
         <w:jc w:val="both"/>
         <w:rPr>
           <w:rFonts w:ascii="Times New Roman" w:eastAsia="Times New Roman" w:hAnsi="Times New Roman" w:cs="Times New Roman"/>
@@ -17872,7 +17872,7 @@
     <w:p>
       <w:pPr>
         <w:spacing w:after="120"/>
-        <w:ind w:left="360" w:firstLine="720"/>
+        <w:ind w:left="360"/>
         <w:jc w:val="both"/>
         <w:rPr>
           <w:rFonts w:ascii="Times New Roman" w:eastAsia="Times New Roman" w:hAnsi="Times New Roman" w:cs="Times New Roman"/>
@@ -17900,7 +17900,7 @@
     <w:p>
       <w:pPr>
         <w:spacing w:after="120"/>
-        <w:ind w:left="360" w:firstLine="720"/>
+        <w:ind w:left="360"/>
         <w:jc w:val="both"/>
         <w:rPr>
           <w:rFonts w:ascii="Times New Roman" w:eastAsia="Times New Roman" w:hAnsi="Times New Roman" w:cs="Times New Roman"/>
@@ -19839,7 +19839,7 @@
     <w:p>
       <w:pPr>
         <w:spacing w:after="160"/>
-        <w:ind w:left="360" w:firstLine="720"/>
+        <w:ind w:left="360"/>
         <w:jc w:val="both"/>
       </w:pPr>
       <w:r>
@@ -19856,7 +19856,7 @@
     <w:p>
       <w:pPr>
         <w:spacing w:after="120"/>
-        <w:ind w:left="360" w:firstLine="720"/>
+        <w:ind w:left="360"/>
         <w:jc w:val="both"/>
         <w:rPr>
           <w:rFonts w:ascii="Times New Roman" w:eastAsia="Times New Roman" w:hAnsi="Times New Roman" w:cs="Times New Roman"/>
@@ -22607,7 +22607,7 @@
     <w:p>
       <w:pPr>
         <w:spacing w:after="120"/>
-        <w:ind w:left="360" w:firstLine="720"/>
+        <w:ind w:left="360"/>
         <w:jc w:val="both"/>
         <w:rPr>
           <w:rFonts w:ascii="Times New Roman" w:eastAsia="Times New Roman" w:hAnsi="Times New Roman" w:cs="Times New Roman"/>
@@ -23907,7 +23907,7 @@
     <w:p>
       <w:pPr>
         <w:spacing w:after="120"/>
-        <w:ind w:left="360" w:firstLine="720"/>
+        <w:ind w:left="360"/>
         <w:jc w:val="both"/>
         <w:rPr>
           <w:rFonts w:ascii="Times New Roman" w:eastAsia="Times New Roman" w:hAnsi="Times New Roman" w:cs="Times New Roman"/>
@@ -23927,7 +23927,7 @@
     <w:p>
       <w:pPr>
         <w:spacing w:after="120"/>
-        <w:ind w:left="360" w:firstLine="720"/>
+        <w:ind w:left="360"/>
         <w:jc w:val="both"/>
         <w:rPr>
           <w:rFonts w:ascii="Times New Roman" w:eastAsia="Times New Roman" w:hAnsi="Times New Roman" w:cs="Times New Roman"/>
@@ -23947,7 +23947,7 @@
     <w:p>
       <w:pPr>
         <w:spacing w:after="120"/>
-        <w:ind w:left="360" w:firstLine="720"/>
+        <w:ind w:left="360"/>
         <w:jc w:val="both"/>
         <w:rPr>
           <w:rFonts w:ascii="Times New Roman" w:eastAsia="Times New Roman" w:hAnsi="Times New Roman" w:cs="Times New Roman"/>
@@ -23967,7 +23967,7 @@
     <w:p>
       <w:pPr>
         <w:spacing w:after="120"/>
-        <w:ind w:left="360" w:firstLine="720"/>
+        <w:ind w:left="360"/>
         <w:jc w:val="both"/>
         <w:rPr>
           <w:rFonts w:ascii="Times New Roman" w:eastAsia="Times New Roman" w:hAnsi="Times New Roman" w:cs="Times New Roman"/>
@@ -23987,7 +23987,7 @@
     <w:p>
       <w:pPr>
         <w:spacing w:after="120"/>
-        <w:ind w:left="360" w:firstLine="720"/>
+        <w:ind w:left="360"/>
         <w:jc w:val="both"/>
         <w:rPr>
           <w:rFonts w:ascii="Times New Roman" w:eastAsia="Times New Roman" w:hAnsi="Times New Roman" w:cs="Times New Roman"/>
@@ -24035,7 +24035,7 @@
     <w:p>
       <w:pPr>
         <w:spacing w:after="120"/>
-        <w:ind w:left="360" w:firstLine="720"/>
+        <w:ind w:left="360"/>
         <w:jc w:val="both"/>
         <w:rPr>
           <w:rFonts w:ascii="Times New Roman" w:eastAsia="Times New Roman" w:hAnsi="Times New Roman" w:cs="Times New Roman"/>
@@ -24055,7 +24055,7 @@
     <w:p>
       <w:pPr>
         <w:spacing w:after="120"/>
-        <w:ind w:left="360" w:firstLine="720"/>
+        <w:ind w:left="360"/>
         <w:jc w:val="both"/>
         <w:rPr>
           <w:rFonts w:ascii="Times New Roman" w:eastAsia="Times New Roman" w:hAnsi="Times New Roman" w:cs="Times New Roman"/>
@@ -24075,7 +24075,7 @@
     <w:p>
       <w:pPr>
         <w:spacing w:after="120"/>
-        <w:ind w:left="360" w:firstLine="720"/>
+        <w:ind w:left="360"/>
         <w:jc w:val="both"/>
         <w:rPr>
           <w:rFonts w:ascii="Times New Roman" w:eastAsia="Times New Roman" w:hAnsi="Times New Roman" w:cs="Times New Roman"/>
@@ -24095,7 +24095,7 @@
     <w:p>
       <w:pPr>
         <w:spacing w:after="120"/>
-        <w:ind w:left="360" w:firstLine="720"/>
+        <w:ind w:left="360"/>
         <w:jc w:val="both"/>
         <w:rPr>
           <w:rFonts w:ascii="Times New Roman" w:eastAsia="Times New Roman" w:hAnsi="Times New Roman" w:cs="Times New Roman"/>
@@ -24115,7 +24115,7 @@
     <w:p>
       <w:pPr>
         <w:spacing w:after="120"/>
-        <w:ind w:left="360" w:firstLine="720"/>
+        <w:ind w:left="360"/>
         <w:jc w:val="both"/>
         <w:rPr>
           <w:rFonts w:ascii="Times New Roman" w:eastAsia="Times New Roman" w:hAnsi="Times New Roman" w:cs="Times New Roman"/>
@@ -24163,7 +24163,7 @@
     <w:p>
       <w:pPr>
         <w:spacing w:after="120"/>
-        <w:ind w:left="360" w:firstLine="720"/>
+        <w:ind w:left="360"/>
         <w:jc w:val="both"/>
         <w:rPr>
           <w:rFonts w:ascii="Times New Roman" w:eastAsia="Times New Roman" w:hAnsi="Times New Roman" w:cs="Times New Roman"/>
@@ -24183,7 +24183,7 @@
     <w:p>
       <w:pPr>
         <w:spacing w:after="120"/>
-        <w:ind w:left="360" w:firstLine="720"/>
+        <w:ind w:left="360"/>
         <w:jc w:val="both"/>
         <w:rPr>
           <w:rFonts w:ascii="Times New Roman" w:eastAsia="Times New Roman" w:hAnsi="Times New Roman" w:cs="Times New Roman"/>
@@ -24203,7 +24203,7 @@
     <w:p>
       <w:pPr>
         <w:spacing w:after="120"/>
-        <w:ind w:left="360" w:firstLine="720"/>
+        <w:ind w:left="360"/>
         <w:jc w:val="both"/>
         <w:rPr>
           <w:rFonts w:ascii="Times New Roman" w:eastAsia="Times New Roman" w:hAnsi="Times New Roman" w:cs="Times New Roman"/>
@@ -24223,7 +24223,7 @@
     <w:p>
       <w:pPr>
         <w:spacing w:after="120"/>
-        <w:ind w:left="360" w:firstLine="720"/>
+        <w:ind w:left="360"/>
         <w:jc w:val="both"/>
         <w:rPr>
           <w:rFonts w:ascii="Times New Roman" w:eastAsia="Times New Roman" w:hAnsi="Times New Roman" w:cs="Times New Roman"/>
@@ -24528,7 +24528,7 @@
     <w:p>
       <w:pPr>
         <w:spacing w:after="120"/>
-        <w:ind w:left="360" w:firstLine="720"/>
+        <w:ind w:left="360"/>
         <w:jc w:val="both"/>
         <w:rPr>
           <w:rFonts w:ascii="Times New Roman" w:eastAsia="Times New Roman" w:hAnsi="Times New Roman" w:cs="Times New Roman"/>
@@ -24548,7 +24548,7 @@
     <w:p>
       <w:pPr>
         <w:spacing w:after="120"/>
-        <w:ind w:left="360" w:firstLine="720"/>
+        <w:ind w:left="360"/>
         <w:jc w:val="both"/>
         <w:rPr>
           <w:rFonts w:ascii="Times New Roman" w:eastAsia="Times New Roman" w:hAnsi="Times New Roman" w:cs="Times New Roman"/>
@@ -24568,7 +24568,7 @@
     <w:p>
       <w:pPr>
         <w:spacing w:after="120"/>
-        <w:ind w:left="360" w:firstLine="720"/>
+        <w:ind w:left="360"/>
         <w:jc w:val="both"/>
         <w:rPr>
           <w:rFonts w:ascii="Times New Roman" w:eastAsia="Times New Roman" w:hAnsi="Times New Roman" w:cs="Times New Roman"/>
@@ -24588,7 +24588,7 @@
     <w:p>
       <w:pPr>
         <w:spacing w:after="120"/>
-        <w:ind w:left="360" w:firstLine="720"/>
+        <w:ind w:left="360"/>
         <w:jc w:val="both"/>
         <w:rPr>
           <w:rFonts w:ascii="Times New Roman" w:eastAsia="Times New Roman" w:hAnsi="Times New Roman" w:cs="Times New Roman"/>
@@ -24636,7 +24636,7 @@
     <w:p>
       <w:pPr>
         <w:spacing w:after="120"/>
-        <w:ind w:left="360" w:firstLine="720"/>
+        <w:ind w:left="360"/>
         <w:jc w:val="both"/>
         <w:rPr>
           <w:rFonts w:ascii="Times New Roman" w:eastAsia="Times New Roman" w:hAnsi="Times New Roman" w:cs="Times New Roman"/>
@@ -24868,7 +24868,7 @@
     <w:p>
       <w:pPr>
         <w:spacing w:after="120"/>
-        <w:ind w:left="360" w:firstLine="720"/>
+        <w:ind w:left="360"/>
         <w:jc w:val="both"/>
         <w:rPr>
           <w:rFonts w:ascii="Times New Roman" w:eastAsia="Times New Roman" w:hAnsi="Times New Roman" w:cs="Times New Roman"/>
@@ -24888,7 +24888,7 @@
     <w:p>
       <w:pPr>
         <w:spacing w:after="120"/>
-        <w:ind w:left="360" w:firstLine="720"/>
+        <w:ind w:left="360"/>
         <w:jc w:val="both"/>
         <w:rPr>
           <w:rFonts w:ascii="Times New Roman" w:eastAsia="Times New Roman" w:hAnsi="Times New Roman" w:cs="Times New Roman"/>
@@ -24908,7 +24908,7 @@
     <w:p>
       <w:pPr>
         <w:spacing w:after="120"/>
-        <w:ind w:left="360" w:firstLine="720"/>
+        <w:ind w:left="360"/>
         <w:jc w:val="both"/>
         <w:rPr>
           <w:rFonts w:ascii="Times New Roman" w:eastAsia="Times New Roman" w:hAnsi="Times New Roman" w:cs="Times New Roman"/>
@@ -24928,7 +24928,7 @@
     <w:p>
       <w:pPr>
         <w:spacing w:after="120"/>
-        <w:ind w:left="360" w:firstLine="720"/>
+        <w:ind w:left="360"/>
         <w:jc w:val="both"/>
         <w:rPr>
           <w:rFonts w:ascii="Times New Roman" w:eastAsia="Times New Roman" w:hAnsi="Times New Roman" w:cs="Times New Roman"/>
@@ -24976,7 +24976,7 @@
     <w:p>
       <w:pPr>
         <w:spacing w:after="120"/>
-        <w:ind w:left="360" w:firstLine="720"/>
+        <w:ind w:left="360"/>
         <w:jc w:val="both"/>
         <w:rPr>
           <w:rFonts w:ascii="Times New Roman" w:eastAsia="Times New Roman" w:hAnsi="Times New Roman" w:cs="Times New Roman"/>
@@ -25004,7 +25004,7 @@
     <w:p>
       <w:pPr>
         <w:spacing w:after="120"/>
-        <w:ind w:left="360" w:firstLine="720"/>
+        <w:ind w:left="360"/>
         <w:jc w:val="both"/>
         <w:rPr>
           <w:rFonts w:ascii="Times New Roman" w:eastAsia="Times New Roman" w:hAnsi="Times New Roman" w:cs="Times New Roman"/>
@@ -25048,7 +25048,7 @@
     <w:p>
       <w:pPr>
         <w:spacing w:after="120"/>
-        <w:ind w:left="360" w:firstLine="720"/>
+        <w:ind w:left="360"/>
         <w:jc w:val="both"/>
         <w:rPr>
           <w:rFonts w:ascii="Times New Roman" w:eastAsia="Times New Roman" w:hAnsi="Times New Roman" w:cs="Times New Roman"/>
@@ -25068,7 +25068,7 @@
     <w:p>
       <w:pPr>
         <w:spacing w:after="120"/>
-        <w:ind w:left="360" w:firstLine="720"/>
+        <w:ind w:left="360"/>
         <w:jc w:val="both"/>
         <w:rPr>
           <w:rFonts w:ascii="Times New Roman" w:eastAsia="Times New Roman" w:hAnsi="Times New Roman" w:cs="Times New Roman"/>
@@ -25104,7 +25104,7 @@
     <w:p>
       <w:pPr>
         <w:spacing w:after="120"/>
-        <w:ind w:left="360" w:firstLine="720"/>
+        <w:ind w:left="360"/>
         <w:jc w:val="both"/>
         <w:rPr>
           <w:rFonts w:ascii="Times New Roman" w:eastAsia="Times New Roman" w:hAnsi="Times New Roman" w:cs="Times New Roman"/>
@@ -25169,7 +25169,7 @@
     <w:p>
       <w:pPr>
         <w:spacing w:after="120"/>
-        <w:ind w:left="360" w:firstLine="720"/>
+        <w:ind w:left="360"/>
         <w:jc w:val="both"/>
         <w:rPr>
           <w:rFonts w:ascii="Times New Roman" w:eastAsia="Times New Roman" w:hAnsi="Times New Roman" w:cs="Times New Roman"/>

</xml_diff>